<commit_message>
stream order fix, gpp water year derviation, anom analysis
</commit_message>
<xml_diff>
--- a/paper/new_references.docx
+++ b/paper/new_references.docx
@@ -1,263 +1,29 @@
 
-<file path=word/document.xml><?xml version="1.0" encoding="utf-8"?>
+<file path=word/document.xml><?xml<w:p><w:r><w:t xml:space="preserve">Running &amp; Zhao, 2021 (8-day product; the reference manager will need an a/b suffix to separate it from the annual MOD17A3HGF entry above) — Running, S. W., &amp; Zhao, M. (2021). MODIS/Terra Gross Primary Productivity Gap-Filled 8-Day L4 Global 500 m SIN Grid V061 [Data set]. NASA EOSDIS Land Processes Distributed Active Archive Center. https://doi.org/10.5067/MODIS/MOD17A2HGF.061</w:t></w:r></w:p> version="1.0" encoding="UTF-8"?>
 <w:document xmlns:w="http://schemas.openxmlformats.org/wordprocessingml/2006/main" xmlns:m="http://schemas.openxmlformats.org/officeDocument/2006/math" xmlns:r="http://schemas.openxmlformats.org/officeDocument/2006/relationships" xmlns:o="urn:schemas-microsoft-com:office:office" xmlns:v="urn:schemas-microsoft-com:vml" xmlns:w10="urn:schemas-microsoft-com:office:word" xmlns:a="http://schemas.openxmlformats.org/drawingml/2006/main" xmlns:pic="http://schemas.openxmlformats.org/drawingml/2006/picture" xmlns:wp="http://schemas.openxmlformats.org/drawingml/2006/wordprocessingDrawing">
-  <w:body>
-    <w:bookmarkStart w:id="21" w:name="X189a87859f25b143203a3726032fab070924d34"/>
-    <w:p>
-      <w:pPr>
-        <w:pStyle w:val="Heading1"/>
-      </w:pPr>
-      <w:r>
-        <w:t xml:space="preserve">References added in the MODIS revision of draft_modis.docx</w:t>
-      </w:r>
-    </w:p>
-    <w:p>
-      <w:pPr>
-        <w:pStyle w:val="FirstParagraph"/>
-      </w:pPr>
-      <w:r>
-        <w:t xml:space="preserve">Entries for the six new in-text citations. Please verify DOIs and dataset citation years before importing.</w:t>
-      </w:r>
-    </w:p>
-    <w:p>
-      <w:pPr>
-        <w:pStyle w:val="BodyText"/>
-      </w:pPr>
-      <w:r>
-        <w:rPr>
-          <w:b/>
-          <w:bCs/>
-        </w:rPr>
-        <w:t xml:space="preserve">Running et al, 2004</w:t>
-      </w:r>
-      <w:r>
-        <w:t xml:space="preserve"> </w:t>
-      </w:r>
-      <w:r>
-        <w:t xml:space="preserve">— Running, S. W., Nemani, R. R., Heinsch, F. A., Zhao, M., Reeves, M., &amp; Hashimoto, H. (2004). A continuous satellite-derived measure of global terrestrial primary production.</w:t>
-      </w:r>
-      <w:r>
-        <w:t xml:space="preserve"> </w:t>
-      </w:r>
-      <w:r>
-        <w:rPr>
-          <w:i/>
-          <w:iCs/>
-        </w:rPr>
-        <w:t xml:space="preserve">BioScience</w:t>
-      </w:r>
-      <w:r>
-        <w:t xml:space="preserve">, 54(6), 547–560. https://doi.org/10.1641/0006-3568(2004)054[0547:ACSMOG]2.0.CO;2</w:t>
-      </w:r>
-    </w:p>
-    <w:p>
-      <w:pPr>
-        <w:pStyle w:val="BodyText"/>
-      </w:pPr>
-      <w:r>
-        <w:rPr>
-          <w:b/>
-          <w:bCs/>
-        </w:rPr>
-        <w:t xml:space="preserve">Running &amp; Zhao, 2021</w:t>
-      </w:r>
-      <w:r>
-        <w:t xml:space="preserve"> </w:t>
-      </w:r>
-      <w:r>
-        <w:t xml:space="preserve">— Running, S. W., &amp; Zhao, M. (2021). MODIS/Terra Gross Primary Productivity Gap-Filled Yearly L4 Global 500 m SIN Grid V061 [Data set]. NASA EOSDIS Land Processes Distributed Active Archive Center. https://doi.org/10.5067/MODIS/MOD17A3HGF.061</w:t>
-      </w:r>
-    </w:p>
-    <w:p>
-      <w:pPr>
-        <w:pStyle w:val="BodyText"/>
-      </w:pPr>
-      <w:r>
-        <w:rPr>
-          <w:b/>
-          <w:bCs/>
-        </w:rPr>
-        <w:t xml:space="preserve">Roy et al, 2016</w:t>
-      </w:r>
-      <w:r>
-        <w:t xml:space="preserve"> </w:t>
-      </w:r>
-      <w:r>
-        <w:t xml:space="preserve">— Roy, D. P., Kovalskyy, V., Zhang, H. K., Vermote, E. F., Yan, L., Kumar, S. S., &amp; Egorov, A. (2016). Characterization of Landsat-7 to Landsat-8 reflective wavelength and normalized difference vegetation index continuity.</w:t>
-      </w:r>
-      <w:r>
-        <w:t xml:space="preserve"> </w:t>
-      </w:r>
-      <w:r>
-        <w:rPr>
-          <w:i/>
-          <w:iCs/>
-        </w:rPr>
-        <w:t xml:space="preserve">Remote Sensing of Environment</w:t>
-      </w:r>
-      <w:r>
-        <w:t xml:space="preserve">, 185, 57–70. https://doi.org/10.1016/j.rse.2015.12.024</w:t>
-      </w:r>
-    </w:p>
-    <w:p>
-      <w:pPr>
-        <w:pStyle w:val="BodyText"/>
-      </w:pPr>
-      <w:r>
-        <w:rPr>
-          <w:b/>
-          <w:bCs/>
-        </w:rPr>
-        <w:t xml:space="preserve">Vogelmann et al, 2016</w:t>
-      </w:r>
-      <w:r>
-        <w:t xml:space="preserve"> </w:t>
-      </w:r>
-      <w:r>
-        <w:t xml:space="preserve">— Vogelmann, J. E., Gallant, A. L., Shi, H., &amp; Zhu, Z. (2016). Perspectives on monitoring gradual change across the continuity of Landsat sensors using time-series data.</w:t>
-      </w:r>
-      <w:r>
-        <w:t xml:space="preserve"> </w:t>
-      </w:r>
-      <w:r>
-        <w:rPr>
-          <w:i/>
-          <w:iCs/>
-        </w:rPr>
-        <w:t xml:space="preserve">Remote Sensing of Environment</w:t>
-      </w:r>
-      <w:r>
-        <w:t xml:space="preserve">, 185, 258–270. https://doi.org/10.1016/j.rse.2016.02.060</w:t>
-      </w:r>
-    </w:p>
-    <w:p>
-      <w:pPr>
-        <w:pStyle w:val="BodyText"/>
-      </w:pPr>
-      <w:r>
-        <w:rPr>
-          <w:b/>
-          <w:bCs/>
-        </w:rPr>
-        <w:t xml:space="preserve">Mu et al, 2011</w:t>
-      </w:r>
-      <w:r>
-        <w:t xml:space="preserve"> </w:t>
-      </w:r>
-      <w:r>
-        <w:t xml:space="preserve">— Mu, Q., Zhao, M., &amp; Running, S. W. (2011). Improvements to a MODIS global terrestrial evapotranspiration algorithm.</w:t>
-      </w:r>
-      <w:r>
-        <w:t xml:space="preserve"> </w:t>
-      </w:r>
-      <w:r>
-        <w:rPr>
-          <w:i/>
-          <w:iCs/>
-        </w:rPr>
-        <w:t xml:space="preserve">Remote Sensing of Environment</w:t>
-      </w:r>
-      <w:r>
-        <w:t xml:space="preserve">, 115(8), 1781–1800. https://doi.org/10.1016/j.rse.2011.02.019</w:t>
-      </w:r>
-    </w:p>
-    <w:p>
-      <w:pPr>
-        <w:pStyle w:val="BodyText"/>
-      </w:pPr>
-      <w:r>
-        <w:rPr>
-          <w:b/>
-          <w:bCs/>
-        </w:rPr>
-        <w:t xml:space="preserve">Thornton et al, 2022</w:t>
-      </w:r>
-      <w:r>
-        <w:t xml:space="preserve"> </w:t>
-      </w:r>
-      <w:r>
-        <w:t xml:space="preserve">— Thornton, M. M., Shrestha, R., Wei, Y., Thornton, P. E., Kao, S.-C., &amp; Wilson, B. E. (2022). Daymet: Daily Surface Weather Data on a 1-km Grid for North America, Version 4 R1 [Data set]. ORNL Distributed Active Archive Center. https://doi.org/10.3334/ORNLDAAC/2129</w:t>
-      </w:r>
-    </w:p>
-    <w:p>
-      <w:pPr>
-        <w:pStyle w:val="BodyText"/>
-      </w:pPr>
-      <w:r>
-        <w:rPr>
-          <w:b/>
-          <w:bCs/>
-        </w:rPr>
-        <w:t xml:space="preserve">Addor et al, 2017</w:t>
-      </w:r>
-      <w:r>
-        <w:t xml:space="preserve"> </w:t>
-      </w:r>
-      <w:r>
-        <w:t xml:space="preserve">— Addor, N., Newman, A. J., Mizukami, N., &amp; Clark, M. P. (2017). The CAMELS data set: catchment attributes and meteorology for large-sample studies.</w:t>
-      </w:r>
-      <w:r>
-        <w:t xml:space="preserve"> </w:t>
-      </w:r>
-      <w:r>
-        <w:rPr>
-          <w:i/>
-          <w:iCs/>
-        </w:rPr>
-        <w:t xml:space="preserve">Hydrology and Earth System Sciences</w:t>
-      </w:r>
-      <w:r>
-        <w:t xml:space="preserve">, 21(10), 5293–5313. https://doi.org/10.5194/hess-21-5293-2017</w:t>
-      </w:r>
-    </w:p>
-    <w:p>
-      <w:pPr>
-        <w:pStyle w:val="BodyText"/>
-      </w:pPr>
-      <w:r>
-        <w:rPr>
-          <w:b/>
-          <w:bCs/>
-        </w:rPr>
-        <w:t xml:space="preserve">Budyko, 1974</w:t>
-      </w:r>
-      <w:r>
-        <w:t xml:space="preserve"> </w:t>
-      </w:r>
-      <w:r>
-        <w:t xml:space="preserve">— Budyko, M. I. (1974).</w:t>
-      </w:r>
-      <w:r>
-        <w:t xml:space="preserve"> </w:t>
-      </w:r>
-      <w:r>
-        <w:rPr>
-          <w:i/>
-          <w:iCs/>
-        </w:rPr>
-        <w:t xml:space="preserve">Climate and Life</w:t>
-      </w:r>
-      <w:r>
-        <w:t xml:space="preserve">. Academic Press, New York.</w:t>
-      </w:r>
-    </w:p>
-    <w:p>
-      <w:pPr>
-        <w:pStyle w:val="BodyText"/>
-      </w:pPr>
-      <w:r>
-        <w:t xml:space="preserve">Where each is cited: Running et al / Running &amp; Zhao — Methods, Data sourcing (MOD17A3HGF product). Roy et al and Vogelmann et al — Methods, Data sourcing (why Landsat was replaced) and Discussion, Synthesis challenges (Landsat sensor-transition artifacts). Mu et al — Methods, Gridded sampling (grid ET). Thornton et al and Addor et al — Methods, Climate analysis (Daymet PET/P aridity index). Budyko — Results, Trends in drivers and outputs.</w:t>
-      </w:r>
-    </w:p>
-    <w:bookmarkEnd w:id="21"/>
+<w:body>
+    <w:bookmarkStart w:id="21" w:name="X189a87859f25b143203a3726032fab070924d34" />
+    <w:p><w:pPr><w:pStyle w:val="Heading1" /></w:pPr><w:r><w:t xml:space="preserve">References added in the MODIS revision of draft_modis.docx</w:t></w:r></w:p>
+    <w:p><w:pPr><w:pStyle w:val="FirstParagraph" /></w:pPr><w:r><w:t xml:space="preserve">Entries for the six new in-text citations. Please verify DOIs and dataset citation years before importing.</w:t></w:r></w:p>
+    <w:p><w:pPr><w:pStyle w:val="BodyText" /></w:pPr><w:r><w:rPr><w:b /><w:bCs /></w:rPr><w:t xml:space="preserve">Running et al, 2004</w:t></w:r><w:r><w:t xml:space="preserve"> </w:t></w:r><w:r><w:t xml:space="preserve">— Running, S. W., Nemani, R. R., Heinsch, F. A., Zhao, M., Reeves, M., &amp; Hashimoto, H. (2004). A continuous satellite-derived measure of global terrestrial primary production.</w:t></w:r><w:r><w:t xml:space="preserve"> </w:t></w:r><w:r><w:rPr><w:i /><w:iCs /></w:rPr><w:t xml:space="preserve">BioScience</w:t></w:r><w:r><w:t xml:space="preserve">, 54(6), 547–560. https://doi.org/10.1641/0006-3568(2004)054[0547:ACSMOG]2.0.CO;2</w:t></w:r></w:p>
+    <w:p><w:pPr><w:pStyle w:val="BodyText" /></w:pPr><w:r><w:rPr><w:b /><w:bCs /></w:rPr><w:t xml:space="preserve">Running &amp; Zhao, 2021</w:t></w:r><w:r><w:t xml:space="preserve"> </w:t></w:r><w:r><w:t xml:space="preserve">— Running, S. W., &amp; Zhao, M. (2021). MODIS/Terra Gross Primary Productivity Gap-Filled Yearly L4 Global 500 m SIN Grid V061 [Data set]. NASA EOSDIS Land Processes Distributed Active Archive Center. https://doi.org/10.5067/MODIS/MOD17A3HGF.061</w:t></w:r></w:p>
+    <w:p><w:pPr><w:pStyle w:val="BodyText" /></w:pPr><w:r><w:rPr><w:b /><w:bCs /></w:rPr><w:t xml:space="preserve">Roy et al, 2016</w:t></w:r><w:r><w:t xml:space="preserve"> </w:t></w:r><w:r><w:t xml:space="preserve">— Roy, D. P., Kovalskyy, V., Zhang, H. K., Vermote, E. F., Yan, L., Kumar, S. S., &amp; Egorov, A. (2016). Characterization of Landsat-7 to Landsat-8 reflective wavelength and normalized difference vegetation index continuity.</w:t></w:r><w:r><w:t xml:space="preserve"> </w:t></w:r><w:r><w:rPr><w:i /><w:iCs /></w:rPr><w:t xml:space="preserve">Remote Sensing of Environment</w:t></w:r><w:r><w:t xml:space="preserve">, 185, 57–70. https://doi.org/10.1016/j.rse.2015.12.024</w:t></w:r></w:p>
+    <w:p><w:pPr><w:pStyle w:val="BodyText" /></w:pPr><w:r><w:rPr><w:b /><w:bCs /></w:rPr><w:t xml:space="preserve">Vogelmann et al, 2016</w:t></w:r><w:r><w:t xml:space="preserve"> </w:t></w:r><w:r><w:t xml:space="preserve">— Vogelmann, J. E., Gallant, A. L., Shi, H., &amp; Zhu, Z. (2016). Perspectives on monitoring gradual change across the continuity of Landsat sensors using time-series data.</w:t></w:r><w:r><w:t xml:space="preserve"> </w:t></w:r><w:r><w:rPr><w:i /><w:iCs /></w:rPr><w:t xml:space="preserve">Remote Sensing of Environment</w:t></w:r><w:r><w:t xml:space="preserve">, 185, 258–270. https://doi.org/10.1016/j.rse.2016.02.060</w:t></w:r></w:p>
+    <w:p><w:pPr><w:pStyle w:val="BodyText" /></w:pPr><w:r><w:rPr><w:b /><w:bCs /></w:rPr><w:t xml:space="preserve">Mu et al, 2011</w:t></w:r><w:r><w:t xml:space="preserve"> </w:t></w:r><w:r><w:t xml:space="preserve">— Mu, Q., Zhao, M., &amp; Running, S. W. (2011). Improvements to a MODIS global terrestrial evapotranspiration algorithm.</w:t></w:r><w:r><w:t xml:space="preserve"> </w:t></w:r><w:r><w:rPr><w:i /><w:iCs /></w:rPr><w:t xml:space="preserve">Remote Sensing of Environment</w:t></w:r><w:r><w:t xml:space="preserve">, 115(8), 1781–1800. https://doi.org/10.1016/j.rse.2011.02.019</w:t></w:r></w:p>
+    <w:p><w:pPr><w:pStyle w:val="BodyText" /></w:pPr><w:r><w:rPr><w:b /><w:bCs /></w:rPr><w:t xml:space="preserve">Thornton et al, 2022</w:t></w:r><w:r><w:t xml:space="preserve"> </w:t></w:r><w:r><w:t xml:space="preserve">— Thornton, M. M., Shrestha, R., Wei, Y., Thornton, P. E., Kao, S.-C., &amp; Wilson, B. E. (2022). Daymet: Daily Surface Weather Data on a 1-km Grid for North America, Version 4 R1 [Data set]. ORNL Distributed Active Archive Center. https://doi.org/10.3334/ORNLDAAC/2129</w:t></w:r></w:p>
+    <w:p><w:pPr><w:pStyle w:val="BodyText" /></w:pPr><w:r><w:rPr><w:b /><w:bCs /></w:rPr><w:t xml:space="preserve">Addor et al, 2017</w:t></w:r><w:r><w:t xml:space="preserve"> </w:t></w:r><w:r><w:t xml:space="preserve">— Addor, N., Newman, A. J., Mizukami, N., &amp; Clark, M. P. (2017). The CAMELS data set: catchment attributes and meteorology for large-sample studies.</w:t></w:r><w:r><w:t xml:space="preserve"> </w:t></w:r><w:r><w:rPr><w:i /><w:iCs /></w:rPr><w:t xml:space="preserve">Hydrology and Earth System Sciences</w:t></w:r><w:r><w:t xml:space="preserve">, 21(10), 5293–5313. https://doi.org/10.5194/hess-21-5293-2017</w:t></w:r></w:p>
+    <w:p><w:pPr><w:pStyle w:val="BodyText" /></w:pPr><w:r><w:rPr><w:b /><w:bCs /></w:rPr><w:t xml:space="preserve">Budyko, 1974</w:t></w:r><w:r><w:t xml:space="preserve"> </w:t></w:r><w:r><w:t xml:space="preserve">— Budyko, M. I. (1974).</w:t></w:r><w:r><w:t xml:space="preserve"> </w:t></w:r><w:r><w:rPr><w:i /><w:iCs /></w:rPr><w:t xml:space="preserve">Climate and Life</w:t></w:r><w:r><w:t xml:space="preserve">. Academic Press, New York.</w:t></w:r></w:p><w:p><w:pPr><w:pStyle w:val="BodyText" /></w:pPr><w:r><w:rPr><w:b /><w:bCs /></w:rPr><w:t xml:space="preserve">Strahler, 1957 — Strahler, A. N. (1957). Quantitative analysis of watershed geomorphology. Transactions, American Geophysical Union, 38(6), 913–920. https://doi.org/10.1029/TR038i006p00913</w:t></w:r></w:p><w:p><w:pPr><w:pStyle w:val="BodyText" /></w:pPr><w:r><w:rPr><w:b /><w:bCs /></w:rPr><w:t xml:space="preserve">Meyer et al, 2007 — Meyer, J. L., Strayer, D. L., Wallace, J. B., Eggert, S. L., Helfman, G. S., &amp; Leonard, N. E. (2007). The contribution of headwater streams to biodiversity in river networks. Journal of the American Water Resources Association, 43(1), 86–103. https://doi.org/10.1111/j.1752-1688.2007.00008.x</w:t></w:r></w:p><w:p><w:pPr><w:pStyle w:val="BodyText" /></w:pPr><w:r><w:rPr><w:b /><w:bCs /></w:rPr><w:t xml:space="preserve">Fritz et al, 2013 — Fritz, K. M., Hagenbuch, E., D’Amico, E., Reif, M., Wigington, P. J., Leibowitz, S. G., Comeleo, R. L., Ebersole, J. L., &amp; Nadeau, T.-L. (2013). Comparing the extent and permanence of headwater streams from two field surveys to values from hydrographic databases and maps. Journal of the American Water Resources Association, 49(4), 867–882. https://doi.org/10.1111/jawr.12040</w:t></w:r></w:p><w:p><w:pPr><w:pStyle w:val="BodyText" /></w:pPr><w:r><w:rPr><w:b /><w:bCs /></w:rPr><w:t xml:space="preserve">Elmore et al, 2013 — Elmore, A. J., Julian, J. P., Guinn, S. M., &amp; Fitzpatrick, M. C. (2013). Potential stream density in Mid-Atlantic U.S. watersheds. PLoS ONE, 8(8), e74819. https://doi.org/10.1371/journal.pone.0074819</w:t></w:r></w:p><w:p><w:pPr><w:pStyle w:val="BodyText" /></w:pPr><w:r><w:rPr><w:b /><w:bCs /></w:rPr><w:t xml:space="preserve">Sen, 1968 — Sen, P. K. (1968). Estimates of the regression coefficient based on Kendall’s tau. Journal of the American Statistical Association, 63(324), 1379–1389. https://doi.org/10.1080/01621459.1968.10480934</w:t></w:r></w:p><w:p><w:pPr><w:pStyle w:val="BodyText" /></w:pPr><w:r><w:rPr><w:b /><w:bCs /></w:rPr><w:t xml:space="preserve">Aschonitis et al, 2017 — Aschonitis, V. G., Papamichail, D., Demertzi, K., Colombani, N., Mastrocicco, M., Ghirardini, A., Castaldelli, G., &amp; Fano, E.-A. (2017). High-resolution global grids of revised Priestley-Taylor and Hargreaves-Samani coefficients for assessing ASCE-standardized reference crop evapotranspiration and solar radiation. Earth System Science Data, 9(2), 615–638. https://doi.org/10.5194/essd-9-615-2017</w:t></w:r></w:p><w:p><w:pPr><w:pStyle w:val="BodyText" /></w:pPr><w:r><w:rPr><w:b /><w:bCs /></w:rPr><w:t xml:space="preserve">Bates et al, 2015 — Bates, D., Mächler, M., Bolker, B., &amp; Walker, S. (2015). Fitting linear mixed-effects models using lme4. Journal of Statistical Software, 67(1), 1–48. https://doi.org/10.18637/jss.v067.i01</w:t></w:r></w:p>
+    <w:p><w:pPr><w:pStyle w:val="BodyText" /></w:pPr><w:r><w:t xml:space="preserve">Where each is cited: Running et al / Running &amp; Zhao — Methods, Data sourcing (MOD17A3HGF product). Roy et al and Vogelmann et al — Methods, Data sourcing (why Landsat was replaced) and Discussion, Synthesis challenges (Landsat sensor-transition artifacts). Mu et al — Methods, Gridded sampling (grid ET). Thornton et al and Addor et al — Methods, Climate analysis (Daymet PET/P aridity index). Budyko — Results, Trends in drivers and outputs.</w:t></w:r><w:r><w:rPr><w:b /><w:bCs /></w:rPr><w:t xml:space="preserve"> Strahler, Meyer et al, Fritz et al and Elmore et al — Methods, Streamflow analysis (headwater definition and the NHDPlus stream-order rule; added 2026-10-22 for the Kampf review). Sen — Methods, Streamflow analysis (trend significance from the Sen slope confidence interval; added 2026-10-22).</w:t></w:r><w:r><w:rPr><w:b /><w:bCs /></w:rPr><w:t xml:space="preserve"> Aschonitis et al — Methods, Climate analysis (PET method behind the aridity index; added 2026-10-22).</w:t></w:r><w:r><w:rPr><w:b /><w:bCs /></w:rPr><w:t xml:space="preserve"> Bates et al — Methods, anomaly analysis (lme4 mixed models; added 2026-10-22).</w:t></w:r><w:r><w:t xml:space="preserve"> Running &amp; Zhao (MOD17A2HGF) — Methods, Data sourcing (water-year GPP sums; added 2026-10-22).</w:t></w:r></w:p>
+    <w:bookmarkEnd w:id="21" />
     <w:sectPr>
-      <w:pgSz w:h="15840" w:w="12240"/>
-      <w:pgMar w:bottom="1440" w:footer="720" w:gutter="0" w:header="720" w:left="1440" w:right="1440" w:top="1440"/>
-      <w:cols w:space="720"/>
-      <w:docGrid w:linePitch="360"/>
+      <w:pgSz w:h="15840" w:w="12240" />
+      <w:pgMar w:bottom="1440" w:footer="720" w:gutter="0" w:header="720" w:left="1440" w:right="1440" w:top="1440" />
+      <w:cols w:space="720" />
+      <w:docGrid w:linePitch="360" />
     </w:sectPr>
   </w:body>
 </w:document>
+
 </file>
 
 <file path=word/comments.xml><?xml version="1.0" encoding="utf-8"?>

</xml_diff>